<commit_message>
docs: complete root cause analysis - 5 fixes identified, ready for implementation
- PROJECT_INSTRUCTIONS.MD: VM specs (Ryzen 9 9950X, 32GB, 2Gbps), Notepad Protocol, SSH helper, transformation timing, order of operations
- DEBUGGING_NOTES.MD: All 5 root causes documented, correct stage ordering (0-4), fix history
- CRITICAL_FIXES_NEEDED.MD: New file - all 5 fixes with priority, dependencies, implementation plan
- CHANGE_LOG.md: Change 12 - root cause analysis complete, fixes pending implementation
</commit_message>
<xml_diff>
--- a/CHANGE_LOG.docx
+++ b/CHANGE_LOG.docx
@@ -2,7 +2,7 @@
 <file path=word/document.xml><?xml version="1.0" encoding="utf-8"?>
 <w:document xmlns:w="http://schemas.openxmlformats.org/wordprocessingml/2006/main" xmlns:m="http://schemas.openxmlformats.org/officeDocument/2006/math" xmlns:r="http://schemas.openxmlformats.org/officeDocument/2006/relationships" xmlns:o="urn:schemas-microsoft-com:office:office" xmlns:v="urn:schemas-microsoft-com:vml" xmlns:w10="urn:schemas-microsoft-com:office:word" xmlns:a="http://schemas.openxmlformats.org/drawingml/2006/main" xmlns:pic="http://schemas.openxmlformats.org/drawingml/2006/picture" xmlns:wp="http://schemas.openxmlformats.org/drawingml/2006/wordprocessingDrawing">
   <w:body>
-    <w:bookmarkStart w:id="31" w:name="qb-timewarp-change-log"/>
+    <w:bookmarkStart w:id="32" w:name="qb-timewarp-change-log"/>
     <w:p>
       <w:pPr>
         <w:pStyle w:val="Heading1"/>
@@ -2818,7 +2818,7 @@
       </w:r>
     </w:p>
     <w:bookmarkEnd w:id="27"/>
-    <w:bookmarkStart w:id="30" w:name="X1edae9b3ed65d4cc0b29e0a884533b7facc2c72"/>
+    <w:bookmarkStart w:id="31" w:name="X1edae9b3ed65d4cc0b29e0a884533b7facc2c72"/>
     <w:p>
       <w:pPr>
         <w:pStyle w:val="Heading2"/>
@@ -4159,9 +4159,413 @@
         <w:t xml:space="preserve">: Unsupported QBXML version</w:t>
       </w:r>
     </w:p>
+    <w:p>
+      <w:r>
+        <w:pict>
+          <v:rect style="width:0;height:1.5pt" o:hralign="center" o:hrstd="t" o:hr="t"/>
+        </w:pict>
+      </w:r>
+    </w:p>
     <w:bookmarkEnd w:id="29"/>
+    <w:bookmarkStart w:id="30" w:name="X991dd9a59dfc52e78a521ec30143da52c70df49"/>
+    <w:p>
+      <w:pPr>
+        <w:pStyle w:val="Heading3"/>
+      </w:pPr>
+      <w:r>
+        <w:t xml:space="preserve">Change 12: Root Cause Analysis &amp; Documentation Overhaul</w:t>
+      </w:r>
+    </w:p>
+    <w:p>
+      <w:pPr>
+        <w:pStyle w:val="FirstParagraph"/>
+      </w:pPr>
+      <w:r>
+        <w:rPr>
+          <w:bCs/>
+          <w:b/>
+        </w:rPr>
+        <w:t xml:space="preserve">Date</w:t>
+      </w:r>
+      <w:r>
+        <w:t xml:space="preserve">: 2026-05-19 (late session)</w:t>
+      </w:r>
+    </w:p>
+    <w:p>
+      <w:pPr>
+        <w:pStyle w:val="BodyText"/>
+      </w:pPr>
+      <w:r>
+        <w:rPr>
+          <w:bCs/>
+          <w:b/>
+        </w:rPr>
+        <w:t xml:space="preserve">What</w:t>
+      </w:r>
+      <w:r>
+        <w:t xml:space="preserve">: Completed comprehensive root cause analysis of import failures. Updated all documentation files to preserve full project understanding across sessions. Created CRITICAL_FIXES_NEEDED.MD.</w:t>
+      </w:r>
+    </w:p>
+    <w:p>
+      <w:pPr>
+        <w:pStyle w:val="BodyText"/>
+      </w:pPr>
+      <w:r>
+        <w:rPr>
+          <w:bCs/>
+          <w:b/>
+        </w:rPr>
+        <w:t xml:space="preserve">Why</w:t>
+      </w:r>
+      <w:r>
+        <w:t xml:space="preserve">: Trial run showed 0 genuine successes (359 phantom successes from detection bug). Five distinct root causes identified that must be fixed before import can succeed. All knowledge committed to files so session refresh loses nothing.</w:t>
+      </w:r>
+    </w:p>
+    <w:p>
+      <w:pPr>
+        <w:pStyle w:val="BodyText"/>
+      </w:pPr>
+      <w:r>
+        <w:rPr>
+          <w:bCs/>
+          <w:b/>
+        </w:rPr>
+        <w:t xml:space="preserve">Root Causes Identified</w:t>
+      </w:r>
+      <w:r>
+        <w:t xml:space="preserve">:</w:t>
+      </w:r>
+      <w:r>
+        <w:t xml:space="preserve"> </w:t>
+      </w:r>
+      <w:r>
+        <w:t xml:space="preserve">1.</w:t>
+      </w:r>
+      <w:r>
+        <w:t xml:space="preserve"> </w:t>
+      </w:r>
+      <w:r>
+        <w:rPr>
+          <w:bCs/>
+          <w:b/>
+        </w:rPr>
+        <w:t xml:space="preserve">Hierarchical names</w:t>
+      </w:r>
+      <w:r>
+        <w:t xml:space="preserve"> </w:t>
+      </w:r>
+      <w:r>
+        <w:t xml:space="preserve">— Full path sent as Name instead of leaf + ParentRef</w:t>
+      </w:r>
+      <w:r>
+        <w:t xml:space="preserve"> </w:t>
+      </w:r>
+      <w:r>
+        <w:t xml:space="preserve">2.</w:t>
+      </w:r>
+      <w:r>
+        <w:t xml:space="preserve"> </w:t>
+      </w:r>
+      <w:r>
+        <w:rPr>
+          <w:bCs/>
+          <w:b/>
+        </w:rPr>
+        <w:t xml:space="preserve">IsActive field</w:t>
+      </w:r>
+      <w:r>
+        <w:t xml:space="preserve"> </w:t>
+      </w:r>
+      <w:r>
+        <w:t xml:space="preserve">— Inactive entities rejected or break reference lookups</w:t>
+      </w:r>
+      <w:r>
+        <w:t xml:space="preserve"> </w:t>
+      </w:r>
+      <w:r>
+        <w:t xml:space="preserve">3.</w:t>
+      </w:r>
+      <w:r>
+        <w:t xml:space="preserve"> </w:t>
+      </w:r>
+      <w:r>
+        <w:rPr>
+          <w:bCs/>
+          <w:b/>
+        </w:rPr>
+        <w:t xml:space="preserve">Account types prerequisite</w:t>
+      </w:r>
+      <w:r>
+        <w:t xml:space="preserve"> </w:t>
+      </w:r>
+      <w:r>
+        <w:t xml:space="preserve">— Must exist before accounts</w:t>
+      </w:r>
+      <w:r>
+        <w:t xml:space="preserve"> </w:t>
+      </w:r>
+      <w:r>
+        <w:t xml:space="preserve">4.</w:t>
+      </w:r>
+      <w:r>
+        <w:t xml:space="preserve"> </w:t>
+      </w:r>
+      <w:r>
+        <w:rPr>
+          <w:bCs/>
+          <w:b/>
+        </w:rPr>
+        <w:t xml:space="preserve">Missing reference types</w:t>
+      </w:r>
+      <w:r>
+        <w:t xml:space="preserve"> </w:t>
+      </w:r>
+      <w:r>
+        <w:t xml:space="preserve">— Sales tax, terms, etc. must exist before referencing entities</w:t>
+      </w:r>
+      <w:r>
+        <w:t xml:space="preserve"> </w:t>
+      </w:r>
+      <w:r>
+        <w:t xml:space="preserve">5.</w:t>
+      </w:r>
+      <w:r>
+        <w:t xml:space="preserve"> </w:t>
+      </w:r>
+      <w:r>
+        <w:rPr>
+          <w:bCs/>
+          <w:b/>
+        </w:rPr>
+        <w:t xml:space="preserve">Field compatibility</w:t>
+      </w:r>
+      <w:r>
+        <w:t xml:space="preserve"> </w:t>
+      </w:r>
+      <w:r>
+        <w:t xml:space="preserve">— SDK 16.0 fields rejected by SDK 15.0</w:t>
+      </w:r>
+      <w:r>
+        <w:t xml:space="preserve"> </w:t>
+      </w:r>
+      <w:r>
+        <w:t xml:space="preserve">6.</w:t>
+      </w:r>
+      <w:r>
+        <w:t xml:space="preserve"> </w:t>
+      </w:r>
+      <w:r>
+        <w:rPr>
+          <w:bCs/>
+          <w:b/>
+        </w:rPr>
+        <w:t xml:space="preserve">(Bug) Success detection</w:t>
+      </w:r>
+      <w:r>
+        <w:t xml:space="preserve"> </w:t>
+      </w:r>
+      <w:r>
+        <w:t xml:space="preserve">— 359 phantom successes from incorrect response parsing</w:t>
+      </w:r>
+    </w:p>
+    <w:p>
+      <w:pPr>
+        <w:pStyle w:val="BodyText"/>
+      </w:pPr>
+      <w:r>
+        <w:rPr>
+          <w:bCs/>
+          <w:b/>
+        </w:rPr>
+        <w:t xml:space="preserve">Correct Order of Operations Defined</w:t>
+      </w:r>
+      <w:r>
+        <w:t xml:space="preserve">:</w:t>
+      </w:r>
+      <w:r>
+        <w:t xml:space="preserve"> </w:t>
+      </w:r>
+      <w:r>
+        <w:t xml:space="preserve">- Stage 0: Account types + missing reference types</w:t>
+      </w:r>
+      <w:r>
+        <w:t xml:space="preserve"> </w:t>
+      </w:r>
+      <w:r>
+        <w:t xml:space="preserve">- Stage 1: Accounts (with hierarchy)</w:t>
+      </w:r>
+      <w:r>
+        <w:t xml:space="preserve"> </w:t>
+      </w:r>
+      <w:r>
+        <w:t xml:space="preserve">- Stage 2: Entities (customers, vendors)</w:t>
+      </w:r>
+      <w:r>
+        <w:t xml:space="preserve"> </w:t>
+      </w:r>
+      <w:r>
+        <w:t xml:space="preserve">- Stage 3: Items</w:t>
+      </w:r>
+      <w:r>
+        <w:t xml:space="preserve"> </w:t>
+      </w:r>
+      <w:r>
+        <w:t xml:space="preserve">- Stage 4: Transactions</w:t>
+      </w:r>
+    </w:p>
+    <w:p>
+      <w:pPr>
+        <w:pStyle w:val="BodyText"/>
+      </w:pPr>
+      <w:r>
+        <w:rPr>
+          <w:bCs/>
+          <w:b/>
+        </w:rPr>
+        <w:t xml:space="preserve">Critical Transformation Timing Documented</w:t>
+      </w:r>
+      <w:r>
+        <w:t xml:space="preserve">:</w:t>
+      </w:r>
+      <w:r>
+        <w:t xml:space="preserve"> </w:t>
+      </w:r>
+      <w:r>
+        <w:t xml:space="preserve">- Export from QB 2023 → Close QB 2023 → Open QB 2021 → Transform → Import</w:t>
+      </w:r>
+    </w:p>
+    <w:p>
+      <w:pPr>
+        <w:pStyle w:val="BodyText"/>
+      </w:pPr>
+      <w:r>
+        <w:rPr>
+          <w:bCs/>
+          <w:b/>
+        </w:rPr>
+        <w:t xml:space="preserve">Files Created</w:t>
+      </w:r>
+      <w:r>
+        <w:t xml:space="preserve">:</w:t>
+      </w:r>
+      <w:r>
+        <w:t xml:space="preserve"> </w:t>
+      </w:r>
+      <w:r>
+        <w:t xml:space="preserve">-</w:t>
+      </w:r>
+      <w:r>
+        <w:t xml:space="preserve"> </w:t>
+      </w:r>
+      <w:r>
+        <w:rPr>
+          <w:rStyle w:val="VerbatimChar"/>
+        </w:rPr>
+        <w:t xml:space="preserve">CRITICAL_FIXES_NEEDED.MD</w:t>
+      </w:r>
+      <w:r>
+        <w:t xml:space="preserve"> </w:t>
+      </w:r>
+      <w:r>
+        <w:t xml:space="preserve">— All 5 fixes with priority, dependencies, implementation details</w:t>
+      </w:r>
+    </w:p>
+    <w:p>
+      <w:pPr>
+        <w:pStyle w:val="BodyText"/>
+      </w:pPr>
+      <w:r>
+        <w:rPr>
+          <w:bCs/>
+          <w:b/>
+        </w:rPr>
+        <w:t xml:space="preserve">Files Updated</w:t>
+      </w:r>
+      <w:r>
+        <w:t xml:space="preserve">:</w:t>
+      </w:r>
+      <w:r>
+        <w:t xml:space="preserve"> </w:t>
+      </w:r>
+      <w:r>
+        <w:t xml:space="preserve">-</w:t>
+      </w:r>
+      <w:r>
+        <w:t xml:space="preserve"> </w:t>
+      </w:r>
+      <w:r>
+        <w:rPr>
+          <w:rStyle w:val="VerbatimChar"/>
+        </w:rPr>
+        <w:t xml:space="preserve">PROJECT_INSTRUCTIONS.MD</w:t>
+      </w:r>
+      <w:r>
+        <w:t xml:space="preserve"> </w:t>
+      </w:r>
+      <w:r>
+        <w:t xml:space="preserve">— Added VM specs (Ryzen 9 9950X, 32GB, 2Gbps), emphasized Notepad Protocol, added SSH helper usage, added transformation timing, added order of operations</w:t>
+      </w:r>
+      <w:r>
+        <w:t xml:space="preserve"> </w:t>
+      </w:r>
+      <w:r>
+        <w:t xml:space="preserve">-</w:t>
+      </w:r>
+      <w:r>
+        <w:t xml:space="preserve"> </w:t>
+      </w:r>
+      <w:r>
+        <w:rPr>
+          <w:rStyle w:val="VerbatimChar"/>
+        </w:rPr>
+        <w:t xml:space="preserve">DEBUGGING_NOTES.MD</w:t>
+      </w:r>
+      <w:r>
+        <w:t xml:space="preserve"> </w:t>
+      </w:r>
+      <w:r>
+        <w:t xml:space="preserve">— Restructured with all 5 root causes clearly documented, correct stage ordering, fix history</w:t>
+      </w:r>
+      <w:r>
+        <w:t xml:space="preserve"> </w:t>
+      </w:r>
+      <w:r>
+        <w:t xml:space="preserve">-</w:t>
+      </w:r>
+      <w:r>
+        <w:t xml:space="preserve"> </w:t>
+      </w:r>
+      <w:r>
+        <w:rPr>
+          <w:rStyle w:val="VerbatimChar"/>
+        </w:rPr>
+        <w:t xml:space="preserve">CHANGE_LOG.md</w:t>
+      </w:r>
+      <w:r>
+        <w:t xml:space="preserve"> </w:t>
+      </w:r>
+      <w:r>
+        <w:t xml:space="preserve">— This entry</w:t>
+      </w:r>
+    </w:p>
+    <w:p>
+      <w:pPr>
+        <w:pStyle w:val="BodyText"/>
+      </w:pPr>
+      <w:r>
+        <w:rPr>
+          <w:bCs/>
+          <w:b/>
+        </w:rPr>
+        <w:t xml:space="preserve">Status</w:t>
+      </w:r>
+      <w:r>
+        <w:t xml:space="preserve">: Staged import architecture ✅ | Root cause analysis ✅ | Fixes identified ✅ | Implementation PENDING</w:t>
+      </w:r>
+    </w:p>
     <w:bookmarkEnd w:id="30"/>
     <w:bookmarkEnd w:id="31"/>
+    <w:bookmarkEnd w:id="32"/>
     <w:sectPr/>
   </w:body>
 </w:document>

</xml_diff>

<commit_message>
Rename all file paths: remove spaces, use underscores for Windows compatibility
- Updated appsettings.json: Joshs_Gold_Coast, QB21_Blank_Template
- Updated QBConnectionManager.cs: added new underscore paths to protected list (kept legacy)
- Updated WorkingDirectoryManager.cs: updated comments/labels
- Updated ConfigurationModels.cs: updated doc examples
- Updated Program.cs: updated folder structure comment
- Updated all docs: SESSION_RESUME, SAFETY_FEATURES, TESTING_CHECKLIST, README, etc.
- Created PATH_REFERENCE.md: new quick reference for all paths
- Build verified: 0 errors
</commit_message>
<xml_diff>
--- a/CHANGE_LOG.docx
+++ b/CHANGE_LOG.docx
@@ -2,7 +2,7 @@
 <file path=word/document.xml><?xml version="1.0" encoding="utf-8"?>
 <w:document xmlns:w="http://schemas.openxmlformats.org/wordprocessingml/2006/main" xmlns:m="http://schemas.openxmlformats.org/officeDocument/2006/math" xmlns:r="http://schemas.openxmlformats.org/officeDocument/2006/relationships" xmlns:o="urn:schemas-microsoft-com:office:office" xmlns:v="urn:schemas-microsoft-com:vml" xmlns:w10="urn:schemas-microsoft-com:office:word" xmlns:a="http://schemas.openxmlformats.org/drawingml/2006/main" xmlns:pic="http://schemas.openxmlformats.org/drawingml/2006/picture" xmlns:wp="http://schemas.openxmlformats.org/drawingml/2006/wordprocessingDrawing">
   <w:body>
-    <w:bookmarkStart w:id="32" w:name="qb-timewarp-change-log"/>
+    <w:bookmarkStart w:id="33" w:name="qb-timewarp-change-log"/>
     <w:p>
       <w:pPr>
         <w:pStyle w:val="Heading1"/>
@@ -2818,7 +2818,7 @@
       </w:r>
     </w:p>
     <w:bookmarkEnd w:id="27"/>
-    <w:bookmarkStart w:id="31" w:name="X1edae9b3ed65d4cc0b29e0a884533b7facc2c72"/>
+    <w:bookmarkStart w:id="32" w:name="X1edae9b3ed65d4cc0b29e0a884533b7facc2c72"/>
     <w:p>
       <w:pPr>
         <w:pStyle w:val="Heading2"/>
@@ -3034,7 +3034,7 @@
         <w:t xml:space="preserve">Why</w:t>
       </w:r>
       <w:r>
-        <w:t xml:space="preserve">: Original QuickBooks company files (Joshua’s Gold Coast, Blank Template, Air Masters) must NEVER be directly modified. The working copy system ensures all operations use disposable copies while originals remain pristine on the Desktop.</w:t>
+        <w:t xml:space="preserve">: Original QuickBooks company files (Joshs_Gold_Coast, QB21_Blank_Template, Air_Masters) must NEVER be directly modified. The working copy system ensures all operations use disposable copies while originals remain pristine on the Desktop.</w:t>
       </w:r>
     </w:p>
     <w:p>
@@ -4563,9 +4563,652 @@
         <w:t xml:space="preserve">: Staged import architecture ✅ | Root cause analysis ✅ | Fixes identified ✅ | Implementation PENDING</w:t>
       </w:r>
     </w:p>
+    <w:p>
+      <w:r>
+        <w:pict>
+          <v:rect style="width:0;height:1.5pt" o:hralign="center" o:hrstd="t" o:hr="t"/>
+        </w:pict>
+      </w:r>
+    </w:p>
     <w:bookmarkEnd w:id="30"/>
+    <w:bookmarkStart w:id="31" w:name="X3f4f9708862bbb84fb9f4d6f942b556bf72cd12"/>
+    <w:p>
+      <w:pPr>
+        <w:pStyle w:val="Heading3"/>
+      </w:pPr>
+      <w:r>
+        <w:t xml:space="preserve">Change 13: File/Folder Rename — Remove Spaces from All Paths</w:t>
+      </w:r>
+    </w:p>
+    <w:p>
+      <w:pPr>
+        <w:pStyle w:val="FirstParagraph"/>
+      </w:pPr>
+      <w:r>
+        <w:rPr>
+          <w:bCs/>
+          <w:b/>
+        </w:rPr>
+        <w:t xml:space="preserve">Date</w:t>
+      </w:r>
+      <w:r>
+        <w:t xml:space="preserve">: 2026-05-19</w:t>
+      </w:r>
+      <w:r>
+        <w:t xml:space="preserve"> </w:t>
+      </w:r>
+      <w:r>
+        <w:rPr>
+          <w:bCs/>
+          <w:b/>
+        </w:rPr>
+        <w:t xml:space="preserve">What</w:t>
+      </w:r>
+      <w:r>
+        <w:t xml:space="preserve">: Joseph renamed all Desktop company file folders and files to use underscores instead of spaces. Updated all documentation, code, and configuration to match.</w:t>
+      </w:r>
+    </w:p>
+    <w:p>
+      <w:pPr>
+        <w:pStyle w:val="BodyText"/>
+      </w:pPr>
+      <w:r>
+        <w:rPr>
+          <w:bCs/>
+          <w:b/>
+        </w:rPr>
+        <w:t xml:space="preserve">Old → New Names</w:t>
+      </w:r>
+      <w:r>
+        <w:t xml:space="preserve">:</w:t>
+      </w:r>
+      <w:r>
+        <w:t xml:space="preserve"> </w:t>
+      </w:r>
+      <w:r>
+        <w:t xml:space="preserve">| Old Name | New Name |</w:t>
+      </w:r>
+      <w:r>
+        <w:t xml:space="preserve"> </w:t>
+      </w:r>
+      <w:r>
+        <w:t xml:space="preserve">|———-|———-|</w:t>
+      </w:r>
+      <w:r>
+        <w:t xml:space="preserve"> </w:t>
+      </w:r>
+      <w:r>
+        <w:t xml:space="preserve">|</w:t>
+      </w:r>
+      <w:r>
+        <w:t xml:space="preserve"> </w:t>
+      </w:r>
+      <w:r>
+        <w:rPr>
+          <w:rStyle w:val="VerbatimChar"/>
+        </w:rPr>
+        <w:t xml:space="preserve">Joshua's Gold Coast</w:t>
+      </w:r>
+      <w:r>
+        <w:t xml:space="preserve"> </w:t>
+      </w:r>
+      <w:r>
+        <w:t xml:space="preserve">|</w:t>
+      </w:r>
+      <w:r>
+        <w:t xml:space="preserve"> </w:t>
+      </w:r>
+      <w:r>
+        <w:rPr>
+          <w:rStyle w:val="VerbatimChar"/>
+        </w:rPr>
+        <w:t xml:space="preserve">Joshs_Gold_Coast</w:t>
+      </w:r>
+      <w:r>
+        <w:t xml:space="preserve"> </w:t>
+      </w:r>
+      <w:r>
+        <w:t xml:space="preserve">|</w:t>
+      </w:r>
+      <w:r>
+        <w:t xml:space="preserve"> </w:t>
+      </w:r>
+      <w:r>
+        <w:t xml:space="preserve">|</w:t>
+      </w:r>
+      <w:r>
+        <w:t xml:space="preserve"> </w:t>
+      </w:r>
+      <w:r>
+        <w:rPr>
+          <w:rStyle w:val="VerbatimChar"/>
+        </w:rPr>
+        <w:t xml:space="preserve">Blank Template</w:t>
+      </w:r>
+      <w:r>
+        <w:t xml:space="preserve"> </w:t>
+      </w:r>
+      <w:r>
+        <w:t xml:space="preserve">|</w:t>
+      </w:r>
+      <w:r>
+        <w:t xml:space="preserve"> </w:t>
+      </w:r>
+      <w:r>
+        <w:rPr>
+          <w:rStyle w:val="VerbatimChar"/>
+        </w:rPr>
+        <w:t xml:space="preserve">QB21_Blank_Template</w:t>
+      </w:r>
+      <w:r>
+        <w:t xml:space="preserve"> </w:t>
+      </w:r>
+      <w:r>
+        <w:t xml:space="preserve">|</w:t>
+      </w:r>
+      <w:r>
+        <w:t xml:space="preserve"> </w:t>
+      </w:r>
+      <w:r>
+        <w:t xml:space="preserve">|</w:t>
+      </w:r>
+      <w:r>
+        <w:t xml:space="preserve"> </w:t>
+      </w:r>
+      <w:r>
+        <w:rPr>
+          <w:rStyle w:val="VerbatimChar"/>
+        </w:rPr>
+        <w:t xml:space="preserve">Air Masters</w:t>
+      </w:r>
+      <w:r>
+        <w:t xml:space="preserve"> </w:t>
+      </w:r>
+      <w:r>
+        <w:t xml:space="preserve">|</w:t>
+      </w:r>
+      <w:r>
+        <w:t xml:space="preserve"> </w:t>
+      </w:r>
+      <w:r>
+        <w:rPr>
+          <w:rStyle w:val="VerbatimChar"/>
+        </w:rPr>
+        <w:t xml:space="preserve">Air_Masters</w:t>
+      </w:r>
+      <w:r>
+        <w:t xml:space="preserve"> </w:t>
+      </w:r>
+      <w:r>
+        <w:t xml:space="preserve">|</w:t>
+      </w:r>
+      <w:r>
+        <w:t xml:space="preserve"> </w:t>
+      </w:r>
+      <w:r>
+        <w:t xml:space="preserve">|</w:t>
+      </w:r>
+      <w:r>
+        <w:t xml:space="preserve"> </w:t>
+      </w:r>
+      <w:r>
+        <w:rPr>
+          <w:rStyle w:val="VerbatimChar"/>
+        </w:rPr>
+        <w:t xml:space="preserve">Air-Masters-QB-2023.qbw</w:t>
+      </w:r>
+      <w:r>
+        <w:t xml:space="preserve"> </w:t>
+      </w:r>
+      <w:r>
+        <w:t xml:space="preserve">|</w:t>
+      </w:r>
+      <w:r>
+        <w:t xml:space="preserve"> </w:t>
+      </w:r>
+      <w:r>
+        <w:rPr>
+          <w:rStyle w:val="VerbatimChar"/>
+        </w:rPr>
+        <w:t xml:space="preserve">Air_Masters_QB_2023.qbw</w:t>
+      </w:r>
+      <w:r>
+        <w:t xml:space="preserve"> </w:t>
+      </w:r>
+      <w:r>
+        <w:t xml:space="preserve">|</w:t>
+      </w:r>
+    </w:p>
+    <w:p>
+      <w:pPr>
+        <w:pStyle w:val="BodyText"/>
+      </w:pPr>
+      <w:r>
+        <w:rPr>
+          <w:bCs/>
+          <w:b/>
+        </w:rPr>
+        <w:t xml:space="preserve">Why</w:t>
+      </w:r>
+      <w:r>
+        <w:t xml:space="preserve">: Spaces in Windows file paths cause issues with command-line tools, batch scripts, Git operations, SSH transfers, and COM/SDK path resolution. Underscores eliminate the need for quoted paths everywhere.</w:t>
+      </w:r>
+    </w:p>
+    <w:p>
+      <w:pPr>
+        <w:pStyle w:val="BodyText"/>
+      </w:pPr>
+      <w:r>
+        <w:rPr>
+          <w:bCs/>
+          <w:b/>
+        </w:rPr>
+        <w:t xml:space="preserve">Files Updated</w:t>
+      </w:r>
+      <w:r>
+        <w:t xml:space="preserve">:</w:t>
+      </w:r>
+      <w:r>
+        <w:t xml:space="preserve"> </w:t>
+      </w:r>
+      <w:r>
+        <w:t xml:space="preserve">-</w:t>
+      </w:r>
+      <w:r>
+        <w:t xml:space="preserve"> </w:t>
+      </w:r>
+      <w:r>
+        <w:rPr>
+          <w:rStyle w:val="VerbatimChar"/>
+        </w:rPr>
+        <w:t xml:space="preserve">appsettings.json</w:t>
+      </w:r>
+      <w:r>
+        <w:t xml:space="preserve"> </w:t>
+      </w:r>
+      <w:r>
+        <w:t xml:space="preserve">— Updated</w:t>
+      </w:r>
+      <w:r>
+        <w:t xml:space="preserve"> </w:t>
+      </w:r>
+      <w:r>
+        <w:rPr>
+          <w:rStyle w:val="VerbatimChar"/>
+        </w:rPr>
+        <w:t xml:space="preserve">SourceFiles.DesktopFolder</w:t>
+      </w:r>
+      <w:r>
+        <w:t xml:space="preserve"> </w:t>
+      </w:r>
+      <w:r>
+        <w:t xml:space="preserve">and</w:t>
+      </w:r>
+      <w:r>
+        <w:t xml:space="preserve"> </w:t>
+      </w:r>
+      <w:r>
+        <w:rPr>
+          <w:rStyle w:val="VerbatimChar"/>
+        </w:rPr>
+        <w:t xml:space="preserve">TargetFiles.DesktopFolder</w:t>
+      </w:r>
+      <w:r>
+        <w:t xml:space="preserve"> </w:t>
+      </w:r>
+      <w:r>
+        <w:t xml:space="preserve">-</w:t>
+      </w:r>
+      <w:r>
+        <w:t xml:space="preserve"> </w:t>
+      </w:r>
+      <w:r>
+        <w:rPr>
+          <w:rStyle w:val="VerbatimChar"/>
+        </w:rPr>
+        <w:t xml:space="preserve">Services/QBConnectionManager.cs</w:t>
+      </w:r>
+      <w:r>
+        <w:t xml:space="preserve"> </w:t>
+      </w:r>
+      <w:r>
+        <w:t xml:space="preserve">— Added new underscore paths to</w:t>
+      </w:r>
+      <w:r>
+        <w:t xml:space="preserve"> </w:t>
+      </w:r>
+      <w:r>
+        <w:rPr>
+          <w:rStyle w:val="VerbatimChar"/>
+        </w:rPr>
+        <w:t xml:space="preserve">ProtectedDesktopFolders</w:t>
+      </w:r>
+      <w:r>
+        <w:t xml:space="preserve"> </w:t>
+      </w:r>
+      <w:r>
+        <w:t xml:space="preserve">(kept legacy space paths for safety)</w:t>
+      </w:r>
+      <w:r>
+        <w:t xml:space="preserve"> </w:t>
+      </w:r>
+      <w:r>
+        <w:t xml:space="preserve">-</w:t>
+      </w:r>
+      <w:r>
+        <w:t xml:space="preserve"> </w:t>
+      </w:r>
+      <w:r>
+        <w:rPr>
+          <w:rStyle w:val="VerbatimChar"/>
+        </w:rPr>
+        <w:t xml:space="preserve">Services/WorkingDirectoryManager.cs</w:t>
+      </w:r>
+      <w:r>
+        <w:t xml:space="preserve"> </w:t>
+      </w:r>
+      <w:r>
+        <w:t xml:space="preserve">— Updated comments and log labels</w:t>
+      </w:r>
+      <w:r>
+        <w:t xml:space="preserve"> </w:t>
+      </w:r>
+      <w:r>
+        <w:t xml:space="preserve">-</w:t>
+      </w:r>
+      <w:r>
+        <w:t xml:space="preserve"> </w:t>
+      </w:r>
+      <w:r>
+        <w:rPr>
+          <w:rStyle w:val="VerbatimChar"/>
+        </w:rPr>
+        <w:t xml:space="preserve">Models/ConfigurationModels.cs</w:t>
+      </w:r>
+      <w:r>
+        <w:t xml:space="preserve"> </w:t>
+      </w:r>
+      <w:r>
+        <w:t xml:space="preserve">— Updated XML doc examples</w:t>
+      </w:r>
+      <w:r>
+        <w:t xml:space="preserve"> </w:t>
+      </w:r>
+      <w:r>
+        <w:t xml:space="preserve">-</w:t>
+      </w:r>
+      <w:r>
+        <w:t xml:space="preserve"> </w:t>
+      </w:r>
+      <w:r>
+        <w:rPr>
+          <w:rStyle w:val="VerbatimChar"/>
+        </w:rPr>
+        <w:t xml:space="preserve">Program.cs</w:t>
+      </w:r>
+      <w:r>
+        <w:t xml:space="preserve"> </w:t>
+      </w:r>
+      <w:r>
+        <w:t xml:space="preserve">— Updated folder structure comment</w:t>
+      </w:r>
+      <w:r>
+        <w:t xml:space="preserve"> </w:t>
+      </w:r>
+      <w:r>
+        <w:t xml:space="preserve">-</w:t>
+      </w:r>
+      <w:r>
+        <w:t xml:space="preserve"> </w:t>
+      </w:r>
+      <w:r>
+        <w:rPr>
+          <w:rStyle w:val="VerbatimChar"/>
+        </w:rPr>
+        <w:t xml:space="preserve">SESSION_RESUME.md</w:t>
+      </w:r>
+      <w:r>
+        <w:t xml:space="preserve"> </w:t>
+      </w:r>
+      <w:r>
+        <w:t xml:space="preserve">— Updated all path references and company file tables</w:t>
+      </w:r>
+      <w:r>
+        <w:t xml:space="preserve"> </w:t>
+      </w:r>
+      <w:r>
+        <w:t xml:space="preserve">-</w:t>
+      </w:r>
+      <w:r>
+        <w:t xml:space="preserve"> </w:t>
+      </w:r>
+      <w:r>
+        <w:rPr>
+          <w:rStyle w:val="VerbatimChar"/>
+        </w:rPr>
+        <w:t xml:space="preserve">SAFETY_FEATURES.md</w:t>
+      </w:r>
+      <w:r>
+        <w:t xml:space="preserve"> </w:t>
+      </w:r>
+      <w:r>
+        <w:t xml:space="preserve">— Updated folder structure, protected patterns, config example</w:t>
+      </w:r>
+      <w:r>
+        <w:t xml:space="preserve"> </w:t>
+      </w:r>
+      <w:r>
+        <w:t xml:space="preserve">-</w:t>
+      </w:r>
+      <w:r>
+        <w:t xml:space="preserve"> </w:t>
+      </w:r>
+      <w:r>
+        <w:rPr>
+          <w:rStyle w:val="VerbatimChar"/>
+        </w:rPr>
+        <w:t xml:space="preserve">TESTING_CHECKLIST.md</w:t>
+      </w:r>
+      <w:r>
+        <w:t xml:space="preserve"> </w:t>
+      </w:r>
+      <w:r>
+        <w:t xml:space="preserve">— Updated verification paths</w:t>
+      </w:r>
+      <w:r>
+        <w:t xml:space="preserve"> </w:t>
+      </w:r>
+      <w:r>
+        <w:t xml:space="preserve">-</w:t>
+      </w:r>
+      <w:r>
+        <w:t xml:space="preserve"> </w:t>
+      </w:r>
+      <w:r>
+        <w:rPr>
+          <w:rStyle w:val="VerbatimChar"/>
+        </w:rPr>
+        <w:t xml:space="preserve">README.md</w:t>
+      </w:r>
+      <w:r>
+        <w:t xml:space="preserve"> </w:t>
+      </w:r>
+      <w:r>
+        <w:t xml:space="preserve">— Updated folder structure diagram</w:t>
+      </w:r>
+      <w:r>
+        <w:t xml:space="preserve"> </w:t>
+      </w:r>
+      <w:r>
+        <w:t xml:space="preserve">-</w:t>
+      </w:r>
+      <w:r>
+        <w:t xml:space="preserve"> </w:t>
+      </w:r>
+      <w:r>
+        <w:rPr>
+          <w:rStyle w:val="VerbatimChar"/>
+        </w:rPr>
+        <w:t xml:space="preserve">README_FOR_NEW_SESSIONS.md</w:t>
+      </w:r>
+      <w:r>
+        <w:t xml:space="preserve"> </w:t>
+      </w:r>
+      <w:r>
+        <w:t xml:space="preserve">— Updated VM file paths table</w:t>
+      </w:r>
+      <w:r>
+        <w:t xml:space="preserve"> </w:t>
+      </w:r>
+      <w:r>
+        <w:t xml:space="preserve">-</w:t>
+      </w:r>
+      <w:r>
+        <w:t xml:space="preserve"> </w:t>
+      </w:r>
+      <w:r>
+        <w:rPr>
+          <w:rStyle w:val="VerbatimChar"/>
+        </w:rPr>
+        <w:t xml:space="preserve">PROJECT_INSTRUCTIONS.MD</w:t>
+      </w:r>
+      <w:r>
+        <w:t xml:space="preserve"> </w:t>
+      </w:r>
+      <w:r>
+        <w:t xml:space="preserve">— Updated VM key paths</w:t>
+      </w:r>
+      <w:r>
+        <w:t xml:space="preserve"> </w:t>
+      </w:r>
+      <w:r>
+        <w:t xml:space="preserve">-</w:t>
+      </w:r>
+      <w:r>
+        <w:t xml:space="preserve"> </w:t>
+      </w:r>
+      <w:r>
+        <w:rPr>
+          <w:rStyle w:val="VerbatimChar"/>
+        </w:rPr>
+        <w:t xml:space="preserve">CHANGE_LOG.md</w:t>
+      </w:r>
+      <w:r>
+        <w:t xml:space="preserve"> </w:t>
+      </w:r>
+      <w:r>
+        <w:t xml:space="preserve">— This entry</w:t>
+      </w:r>
+      <w:r>
+        <w:t xml:space="preserve"> </w:t>
+      </w:r>
+      <w:r>
+        <w:t xml:space="preserve">-</w:t>
+      </w:r>
+      <w:r>
+        <w:t xml:space="preserve"> </w:t>
+      </w:r>
+      <w:r>
+        <w:rPr>
+          <w:rStyle w:val="VerbatimChar"/>
+        </w:rPr>
+        <w:t xml:space="preserve">POPUP_HANDLING.md</w:t>
+      </w:r>
+      <w:r>
+        <w:t xml:space="preserve"> </w:t>
+      </w:r>
+      <w:r>
+        <w:t xml:space="preserve">— Updated Blank Template reference</w:t>
+      </w:r>
+      <w:r>
+        <w:t xml:space="preserve"> </w:t>
+      </w:r>
+      <w:r>
+        <w:t xml:space="preserve">-</w:t>
+      </w:r>
+      <w:r>
+        <w:t xml:space="preserve"> </w:t>
+      </w:r>
+      <w:r>
+        <w:rPr>
+          <w:rStyle w:val="VerbatimChar"/>
+        </w:rPr>
+        <w:t xml:space="preserve">DEBUGGING_NOTES.MD</w:t>
+      </w:r>
+      <w:r>
+        <w:t xml:space="preserve"> </w:t>
+      </w:r>
+      <w:r>
+        <w:t xml:space="preserve">— No path changes needed (uses generic references)</w:t>
+      </w:r>
+      <w:r>
+        <w:t xml:space="preserve"> </w:t>
+      </w:r>
+      <w:r>
+        <w:t xml:space="preserve">-</w:t>
+      </w:r>
+      <w:r>
+        <w:t xml:space="preserve"> </w:t>
+      </w:r>
+      <w:r>
+        <w:rPr>
+          <w:rStyle w:val="VerbatimChar"/>
+        </w:rPr>
+        <w:t xml:space="preserve">PATH_REFERENCE.md</w:t>
+      </w:r>
+      <w:r>
+        <w:t xml:space="preserve"> </w:t>
+      </w:r>
+      <w:r>
+        <w:t xml:space="preserve">—</w:t>
+      </w:r>
+      <w:r>
+        <w:t xml:space="preserve"> </w:t>
+      </w:r>
+      <w:r>
+        <w:rPr>
+          <w:bCs/>
+          <w:b/>
+        </w:rPr>
+        <w:t xml:space="preserve">NEW</w:t>
+      </w:r>
+      <w:r>
+        <w:t xml:space="preserve">: Quick reference for all file paths with old→new mapping</w:t>
+      </w:r>
+    </w:p>
+    <w:p>
+      <w:pPr>
+        <w:pStyle w:val="BodyText"/>
+      </w:pPr>
+      <w:r>
+        <w:rPr>
+          <w:bCs/>
+          <w:b/>
+        </w:rPr>
+        <w:t xml:space="preserve">CRITICAL</w:t>
+      </w:r>
+      <w:r>
+        <w:t xml:space="preserve">:</w:t>
+      </w:r>
+      <w:r>
+        <w:t xml:space="preserve"> </w:t>
+      </w:r>
+      <w:r>
+        <w:rPr>
+          <w:rStyle w:val="VerbatimChar"/>
+        </w:rPr>
+        <w:t xml:space="preserve">QBConnectionManager.cs</w:t>
+      </w:r>
+      <w:r>
+        <w:t xml:space="preserve"> </w:t>
+      </w:r>
+      <w:r>
+        <w:t xml:space="preserve">now blocks BOTH old (space) paths AND new (underscore) paths from direct access, ensuring safety even if old paths somehow persist.</w:t>
+      </w:r>
+    </w:p>
     <w:bookmarkEnd w:id="31"/>
     <w:bookmarkEnd w:id="32"/>
+    <w:bookmarkEnd w:id="33"/>
     <w:sectPr/>
   </w:body>
 </w:document>

</xml_diff>